<commit_message>
docs: add evidence retention cron setup
</commit_message>
<xml_diff>
--- a/docs/Virtual-RUN-Production-Server-Installation-Guide-version-3.7.docx
+++ b/docs/Virtual-RUN-Production-Server-Installation-Guide-version-3.7.docx
@@ -1596,7 +1596,7 @@
                 <w:rFonts w:ascii="Tahoma" w:hAnsi="Tahoma" w:eastAsia="Tahoma" w:cs="Tahoma"/>
                 <w:sz w:val="18"/>
               </w:rPr>
-              <w:t>SITE_URL, Supabase public URL, app keys, Turnstile และ encryption key</w:t>
+              <w:t>SITE_URL, Supabase public URL, app keys, Turnstile, encryption key และ Evidence Retention cron secret</w:t>
             </w:r>
           </w:p>
         </w:tc>
@@ -3277,7 +3277,7 @@
                 <w:rFonts w:ascii="Tahoma" w:hAnsi="Tahoma" w:eastAsia="Tahoma" w:cs="Tahoma"/>
                 <w:sz w:val="18"/>
               </w:rPr>
-              <w:t>ทำทุกขั้นตอน รวมติดตั้ง Supabase และรัน migration ทั้ง 55 ไฟล์</w:t>
+              <w:t>ทำทุกขั้นตอน รวมติดตั้ง Supabase และรัน migration ทั้ง 56 ไฟล์</w:t>
             </w:r>
           </w:p>
         </w:tc>
@@ -5518,10 +5518,7 @@
         <w:pStyle w:val="BodyText"/>
       </w:pPr>
       <w:r>
-        <w:rPr>
-          <w:rFonts w:ascii="Tahoma" w:hAnsi="Tahoma" w:eastAsia="Tahoma" w:cs="Tahoma"/>
-        </w:rPr>
-        <w:t>branch ต้องเป็น version-3.7 ส่วน commit อ้างอิงของคู่มือนี้คือ 4913fc71475bc5ad5038e4c0a7ca194c432b63ab</w:t>
+        <w:t xml:space="preserve">branch ต้องเป็น version-3.7 ส่วน commit อ้างอิงของคู่มือนี้คือ c4078996e32d580f232abe25a99bbc8148e9f385</w:t>
       </w:r>
     </w:p>
     <w:p>
@@ -5625,10 +5622,7 @@
         <w:pStyle w:val="BodyText"/>
       </w:pPr>
       <w:r>
-        <w:rPr>
-          <w:rFonts w:ascii="Tahoma" w:hAnsi="Tahoma" w:eastAsia="Tahoma" w:cs="Tahoma"/>
-        </w:rPr>
-        <w:t>รันไฟล์ migration ทั้งหมดตามลำดับชื่อเพียงครั้งเดียว ปัจจุบัน repository มี 55 ไฟล์ ใช้ set -e และ ON_ERROR_STOP เพื่อหยุดทันทีเมื่อพบ error</w:t>
+        <w:t xml:space="preserve">รันไฟล์ migration ทั้งหมดตามลำดับชื่อเพียงครั้งเดียว ปัจจุบัน repository มี 56 ไฟล์ ใช้ set -e และ ON_ERROR_STOP เพื่อหยุดทันทีเมื่อพบ error</w:t>
       </w:r>
     </w:p>
     <w:p>
@@ -5761,10 +5755,7 @@
         <w:pStyle w:val="BodyText"/>
       </w:pPr>
       <w:r>
-        <w:rPr>
-          <w:rFonts w:ascii="Tahoma" w:hAnsi="Tahoma" w:eastAsia="Tahoma" w:cs="Tahoma"/>
-        </w:rPr>
-        <w:t>อย่ารันทั้ง 55 ไฟล์ซ้ำ หาก production ก่อนหน้าอยู่ที่ version 3.5 หรือ 3.6 และยังไม่มีสอง migration ต่อไปนี้ ให้รันตามลำดับ</w:t>
+        <w:t xml:space="preserve">อย่ารันทั้ง 56 ไฟล์ซ้ำ หาก production ก่อนหน้าอยู่ที่ version 3.5, 3.6 หรือ 3.7 รุ่นก่อนหน้า และยังไม่มีสาม migration ต่อไปนี้ ให้รันตามลำดับ</w:t>
       </w:r>
     </w:p>
     <w:p>
@@ -5776,81 +5767,31 @@
         <w:shd w:fill="F2F2F2"/>
       </w:pPr>
       <w:r>
-        <w:rPr>
-          <w:rFonts w:ascii="Tahoma" w:hAnsi="Tahoma" w:eastAsia="Tahoma" w:cs="Tahoma"/>
-          <w:color w:val="404040"/>
-          <w:sz w:val="16"/>
-        </w:rPr>
-        <w:t>cd /webserver/vrrun_bu_ac_th</w:t>
-      </w:r>
-      <w:r>
-        <w:rPr>
-          <w:rFonts w:ascii="Tahoma" w:hAnsi="Tahoma" w:eastAsia="Tahoma" w:cs="Tahoma"/>
-        </w:rPr>
+        <w:t xml:space="preserve">cd /webserver/vrrun_bu_ac_th</w:t>
         <w:br/>
       </w:r>
       <w:r>
-        <w:rPr>
-          <w:rFonts w:ascii="Tahoma" w:hAnsi="Tahoma" w:eastAsia="Tahoma" w:cs="Tahoma"/>
-          <w:color w:val="404040"/>
-          <w:sz w:val="16"/>
-        </w:rPr>
-        <w:t>docker exec -i supabase-db psql -U postgres -d postgres \</w:t>
-      </w:r>
-      <w:r>
-        <w:rPr>
-          <w:rFonts w:ascii="Tahoma" w:hAnsi="Tahoma" w:eastAsia="Tahoma" w:cs="Tahoma"/>
-        </w:rPr>
+        <w:t xml:space="preserve">docker exec -i supabase-db psql -U postgres -d postgres \</w:t>
         <w:br/>
       </w:r>
       <w:r>
-        <w:rPr>
-          <w:rFonts w:ascii="Tahoma" w:hAnsi="Tahoma" w:eastAsia="Tahoma" w:cs="Tahoma"/>
-          <w:color w:val="404040"/>
-          <w:sz w:val="16"/>
-        </w:rPr>
         <w:t xml:space="preserve">  -v ON_ERROR_STOP=1 &lt; supabase/migrations/20260907075311_smtp_settings.sql</w:t>
-      </w:r>
-      <w:r>
-        <w:rPr>
-          <w:rFonts w:ascii="Tahoma" w:hAnsi="Tahoma" w:eastAsia="Tahoma" w:cs="Tahoma"/>
-        </w:rPr>
         <w:br/>
       </w:r>
       <w:r>
-        <w:rPr>
-          <w:rFonts w:ascii="Tahoma" w:hAnsi="Tahoma" w:eastAsia="Tahoma" w:cs="Tahoma"/>
-          <w:color w:val="404040"/>
-          <w:sz w:val="16"/>
-        </w:rPr>
-      </w:r>
-      <w:r>
-        <w:rPr>
-          <w:rFonts w:ascii="Tahoma" w:hAnsi="Tahoma" w:eastAsia="Tahoma" w:cs="Tahoma"/>
-        </w:rPr>
+        <w:t xml:space="preserve">docker exec -i supabase-db psql -U postgres -d postgres \</w:t>
         <w:br/>
       </w:r>
       <w:r>
-        <w:rPr>
-          <w:rFonts w:ascii="Tahoma" w:hAnsi="Tahoma" w:eastAsia="Tahoma" w:cs="Tahoma"/>
-          <w:color w:val="404040"/>
-          <w:sz w:val="16"/>
-        </w:rPr>
-        <w:t>docker exec -i supabase-db psql -U postgres -d postgres \</w:t>
-      </w:r>
-      <w:r>
-        <w:rPr>
-          <w:rFonts w:ascii="Tahoma" w:hAnsi="Tahoma" w:eastAsia="Tahoma" w:cs="Tahoma"/>
-        </w:rPr>
+        <w:t xml:space="preserve">  -v ON_ERROR_STOP=1 &lt; supabase/migrations/20260908013509_integration_settings.sql</w:t>
         <w:br/>
       </w:r>
       <w:r>
-        <w:rPr>
-          <w:rFonts w:ascii="Tahoma" w:hAnsi="Tahoma" w:eastAsia="Tahoma" w:cs="Tahoma"/>
-          <w:color w:val="404040"/>
-          <w:sz w:val="16"/>
-        </w:rPr>
-        <w:t xml:space="preserve">  -v ON_ERROR_STOP=1 &lt; supabase/migrations/20260908013509_integration_settings.sql</w:t>
+        <w:t xml:space="preserve">docker exec -i supabase-db psql -U postgres -d postgres \</w:t>
+        <w:br/>
+      </w:r>
+      <w:r>
+        <w:t xml:space="preserve">  -v ON_ERROR_STOP=1 &lt; supabase/migrations/20260908051746_add_evidence_retention.sql</w:t>
       </w:r>
     </w:p>
     <w:p>
@@ -5875,137 +5816,43 @@
         <w:shd w:fill="F2F2F2"/>
       </w:pPr>
       <w:r>
-        <w:rPr>
-          <w:rFonts w:ascii="Tahoma" w:hAnsi="Tahoma" w:eastAsia="Tahoma" w:cs="Tahoma"/>
-          <w:color w:val="404040"/>
-          <w:sz w:val="16"/>
-        </w:rPr>
-        <w:t>docker exec -i supabase-db psql -U postgres -d postgres &lt;&lt;'SQL'</w:t>
-      </w:r>
-      <w:r>
-        <w:rPr>
-          <w:rFonts w:ascii="Tahoma" w:hAnsi="Tahoma" w:eastAsia="Tahoma" w:cs="Tahoma"/>
-        </w:rPr>
+        <w:t xml:space="preserve">docker exec -i supabase-db psql -U postgres -d postgres &lt;&lt;'SQL'</w:t>
         <w:br/>
       </w:r>
       <w:r>
-        <w:rPr>
-          <w:rFonts w:ascii="Tahoma" w:hAnsi="Tahoma" w:eastAsia="Tahoma" w:cs="Tahoma"/>
-          <w:color w:val="404040"/>
-          <w:sz w:val="16"/>
-        </w:rPr>
-        <w:t>select to_regclass('public.smtp_settings') as smtp_settings,</w:t>
-      </w:r>
-      <w:r>
-        <w:rPr>
-          <w:rFonts w:ascii="Tahoma" w:hAnsi="Tahoma" w:eastAsia="Tahoma" w:cs="Tahoma"/>
-        </w:rPr>
+        <w:t xml:space="preserve">select to_regclass('public.smtp_settings') as smtp_settings,</w:t>
         <w:br/>
       </w:r>
       <w:r>
-        <w:rPr>
-          <w:rFonts w:ascii="Tahoma" w:hAnsi="Tahoma" w:eastAsia="Tahoma" w:cs="Tahoma"/>
-          <w:color w:val="404040"/>
-          <w:sz w:val="16"/>
-        </w:rPr>
-        <w:t xml:space="preserve">       to_regclass('public.integration_settings') as integration_settings;</w:t>
-      </w:r>
-      <w:r>
-        <w:rPr>
-          <w:rFonts w:ascii="Tahoma" w:hAnsi="Tahoma" w:eastAsia="Tahoma" w:cs="Tahoma"/>
-        </w:rPr>
+        <w:t xml:space="preserve">       to_regclass('public.integration_settings') as integration_settings,</w:t>
         <w:br/>
       </w:r>
       <w:r>
-        <w:rPr>
-          <w:rFonts w:ascii="Tahoma" w:hAnsi="Tahoma" w:eastAsia="Tahoma" w:cs="Tahoma"/>
-          <w:color w:val="404040"/>
-          <w:sz w:val="16"/>
-        </w:rPr>
-      </w:r>
-      <w:r>
-        <w:rPr>
-          <w:rFonts w:ascii="Tahoma" w:hAnsi="Tahoma" w:eastAsia="Tahoma" w:cs="Tahoma"/>
-        </w:rPr>
+        <w:t xml:space="preserve">       to_regclass('public.evidence_cleanup_runs') as evidence_cleanup_runs;</w:t>
         <w:br/>
       </w:r>
       <w:r>
-        <w:rPr>
-          <w:rFonts w:ascii="Tahoma" w:hAnsi="Tahoma" w:eastAsia="Tahoma" w:cs="Tahoma"/>
-          <w:color w:val="404040"/>
-          <w:sz w:val="16"/>
-        </w:rPr>
-        <w:t>select grantee, table_name, privilege_type</w:t>
-      </w:r>
-      <w:r>
-        <w:rPr>
-          <w:rFonts w:ascii="Tahoma" w:hAnsi="Tahoma" w:eastAsia="Tahoma" w:cs="Tahoma"/>
-        </w:rPr>
+        <w:t xml:space="preserve">select grantee, table_name, privilege_type</w:t>
         <w:br/>
       </w:r>
       <w:r>
-        <w:rPr>
-          <w:rFonts w:ascii="Tahoma" w:hAnsi="Tahoma" w:eastAsia="Tahoma" w:cs="Tahoma"/>
-          <w:color w:val="404040"/>
-          <w:sz w:val="16"/>
-        </w:rPr>
-        <w:t>from information_schema.role_table_grants</w:t>
-      </w:r>
-      <w:r>
-        <w:rPr>
-          <w:rFonts w:ascii="Tahoma" w:hAnsi="Tahoma" w:eastAsia="Tahoma" w:cs="Tahoma"/>
-        </w:rPr>
+        <w:t xml:space="preserve">from information_schema.role_table_grants</w:t>
         <w:br/>
       </w:r>
       <w:r>
-        <w:rPr>
-          <w:rFonts w:ascii="Tahoma" w:hAnsi="Tahoma" w:eastAsia="Tahoma" w:cs="Tahoma"/>
-          <w:color w:val="404040"/>
-          <w:sz w:val="16"/>
-        </w:rPr>
-        <w:t>where table_schema = 'public'</w:t>
-      </w:r>
-      <w:r>
-        <w:rPr>
-          <w:rFonts w:ascii="Tahoma" w:hAnsi="Tahoma" w:eastAsia="Tahoma" w:cs="Tahoma"/>
-        </w:rPr>
+        <w:t xml:space="preserve">where table_schema = 'public'</w:t>
         <w:br/>
       </w:r>
       <w:r>
-        <w:rPr>
-          <w:rFonts w:ascii="Tahoma" w:hAnsi="Tahoma" w:eastAsia="Tahoma" w:cs="Tahoma"/>
-          <w:color w:val="404040"/>
-          <w:sz w:val="16"/>
-        </w:rPr>
-        <w:t xml:space="preserve">  and table_name in ('smtp_settings', 'integration_settings')</w:t>
-      </w:r>
-      <w:r>
-        <w:rPr>
-          <w:rFonts w:ascii="Tahoma" w:hAnsi="Tahoma" w:eastAsia="Tahoma" w:cs="Tahoma"/>
-        </w:rPr>
+        <w:t xml:space="preserve">  and table_name in ('smtp_settings', 'integration_settings', 'evidence_cleanup_runs')</w:t>
         <w:br/>
       </w:r>
       <w:r>
-        <w:rPr>
-          <w:rFonts w:ascii="Tahoma" w:hAnsi="Tahoma" w:eastAsia="Tahoma" w:cs="Tahoma"/>
-          <w:color w:val="404040"/>
-          <w:sz w:val="16"/>
-        </w:rPr>
-        <w:t>order by table_name, grantee, privilege_type;</w:t>
-      </w:r>
-      <w:r>
-        <w:rPr>
-          <w:rFonts w:ascii="Tahoma" w:hAnsi="Tahoma" w:eastAsia="Tahoma" w:cs="Tahoma"/>
-        </w:rPr>
+        <w:t xml:space="preserve">order by table_name, grantee, privilege_type;</w:t>
         <w:br/>
       </w:r>
       <w:r>
-        <w:rPr>
-          <w:rFonts w:ascii="Tahoma" w:hAnsi="Tahoma" w:eastAsia="Tahoma" w:cs="Tahoma"/>
-          <w:color w:val="404040"/>
-          <w:sz w:val="16"/>
-        </w:rPr>
-        <w:t>SQL</w:t>
+        <w:t xml:space="preserve">SQL</w:t>
       </w:r>
     </w:p>
     <w:p>
@@ -6013,10 +5860,7 @@
         <w:pStyle w:val="BodyText"/>
       </w:pPr>
       <w:r>
-        <w:rPr>
-          <w:rFonts w:ascii="Tahoma" w:hAnsi="Tahoma" w:eastAsia="Tahoma" w:cs="Tahoma"/>
-        </w:rPr>
-        <w:t>ผลที่ถูกต้องคือตารางทั้งสองมีอยู่ browser roles anon และ authenticated ไม่มี grant ส่วน service_role มี SELECT, INSERT และ UPDATE RLS ต้องเปิดอยู่ทั้งสองตาราง และ secret ในฐานข้อมูลต้องเป็น ciphertext เท่านั้น</w:t>
+        <w:t xml:space="preserve">ผลที่ถูกต้องคือตารางทั้งสามมีอยู่ browser roles anon และ authenticated ไม่มี grant ส่วน service_role เข้าถึงได้ตามหน้าที่ RLS ต้องเปิดอยู่ทุกตาราง secret ในฐานข้อมูลต้องเป็น ciphertext และ cleanup audit ต้องไม่เปิดให้ browser อ่าน</w:t>
       </w:r>
     </w:p>
     <w:p>
@@ -6124,219 +5968,59 @@
         <w:shd w:fill="F2F2F2"/>
       </w:pPr>
       <w:r>
-        <w:rPr>
-          <w:rFonts w:ascii="Tahoma" w:hAnsi="Tahoma" w:eastAsia="Tahoma" w:cs="Tahoma"/>
-          <w:color w:val="404040"/>
-          <w:sz w:val="16"/>
-        </w:rPr>
-        <w:t>SITE_URL=https://vrrun.bu.ac.th</w:t>
-      </w:r>
-      <w:r>
-        <w:rPr>
-          <w:rFonts w:ascii="Tahoma" w:hAnsi="Tahoma" w:eastAsia="Tahoma" w:cs="Tahoma"/>
-        </w:rPr>
+        <w:t xml:space="preserve">SITE_URL=https://vrrun.bu.ac.th</w:t>
         <w:br/>
       </w:r>
       <w:r>
-        <w:rPr>
-          <w:rFonts w:ascii="Tahoma" w:hAnsi="Tahoma" w:eastAsia="Tahoma" w:cs="Tahoma"/>
-          <w:color w:val="404040"/>
-          <w:sz w:val="16"/>
-        </w:rPr>
-        <w:t>NEXT_PUBLIC_SITE_URL=https://vrrun.bu.ac.th</w:t>
-      </w:r>
-      <w:r>
-        <w:rPr>
-          <w:rFonts w:ascii="Tahoma" w:hAnsi="Tahoma" w:eastAsia="Tahoma" w:cs="Tahoma"/>
-        </w:rPr>
+        <w:t xml:space="preserve">NEXT_PUBLIC_SITE_URL=https://vrrun.bu.ac.th</w:t>
         <w:br/>
       </w:r>
       <w:r>
-        <w:rPr>
-          <w:rFonts w:ascii="Tahoma" w:hAnsi="Tahoma" w:eastAsia="Tahoma" w:cs="Tahoma"/>
-          <w:color w:val="404040"/>
-          <w:sz w:val="16"/>
-        </w:rPr>
-      </w:r>
-      <w:r>
-        <w:rPr>
-          <w:rFonts w:ascii="Tahoma" w:hAnsi="Tahoma" w:eastAsia="Tahoma" w:cs="Tahoma"/>
-        </w:rPr>
+        <w:t xml:space="preserve">NEXT_PUBLIC_SUPABASE_URL=https://api.vrrun.bu.ac.th</w:t>
         <w:br/>
       </w:r>
       <w:r>
-        <w:rPr>
-          <w:rFonts w:ascii="Tahoma" w:hAnsi="Tahoma" w:eastAsia="Tahoma" w:cs="Tahoma"/>
-          <w:color w:val="404040"/>
-          <w:sz w:val="16"/>
-        </w:rPr>
-        <w:t>NEXT_PUBLIC_SUPABASE_URL=https://api.vrrun.bu.ac.th</w:t>
-      </w:r>
-      <w:r>
-        <w:rPr>
-          <w:rFonts w:ascii="Tahoma" w:hAnsi="Tahoma" w:eastAsia="Tahoma" w:cs="Tahoma"/>
-        </w:rPr>
+        <w:t xml:space="preserve">SUPABASE_URL=https://api.vrrun.bu.ac.th</w:t>
         <w:br/>
       </w:r>
       <w:r>
-        <w:rPr>
-          <w:rFonts w:ascii="Tahoma" w:hAnsi="Tahoma" w:eastAsia="Tahoma" w:cs="Tahoma"/>
-          <w:color w:val="404040"/>
-          <w:sz w:val="16"/>
-        </w:rPr>
-        <w:t>SUPABASE_URL=https://api.vrrun.bu.ac.th</w:t>
-      </w:r>
-      <w:r>
-        <w:rPr>
-          <w:rFonts w:ascii="Tahoma" w:hAnsi="Tahoma" w:eastAsia="Tahoma" w:cs="Tahoma"/>
-        </w:rPr>
+        <w:t xml:space="preserve">NEXT_PUBLIC_SUPABASE_PUBLISHABLE_KEY=&lt;SUPABASE_PUBLISHABLE_KEY&gt;</w:t>
         <w:br/>
       </w:r>
       <w:r>
-        <w:rPr>
-          <w:rFonts w:ascii="Tahoma" w:hAnsi="Tahoma" w:eastAsia="Tahoma" w:cs="Tahoma"/>
-          <w:color w:val="404040"/>
-          <w:sz w:val="16"/>
-        </w:rPr>
-        <w:t>NEXT_PUBLIC_SUPABASE_PUBLISHABLE_KEY=&lt;SUPABASE_PUBLISHABLE_KEY&gt;</w:t>
-      </w:r>
-      <w:r>
-        <w:rPr>
-          <w:rFonts w:ascii="Tahoma" w:hAnsi="Tahoma" w:eastAsia="Tahoma" w:cs="Tahoma"/>
-        </w:rPr>
+        <w:t xml:space="preserve">SUPABASE_SECRET_KEY=&lt;SUPABASE_SECRET_KEY&gt;</w:t>
         <w:br/>
       </w:r>
       <w:r>
-        <w:rPr>
-          <w:rFonts w:ascii="Tahoma" w:hAnsi="Tahoma" w:eastAsia="Tahoma" w:cs="Tahoma"/>
-          <w:color w:val="404040"/>
-          <w:sz w:val="16"/>
-        </w:rPr>
-        <w:t>SUPABASE_SECRET_KEY=&lt;SUPABASE_SECRET_KEY&gt;</w:t>
-      </w:r>
-      <w:r>
-        <w:rPr>
-          <w:rFonts w:ascii="Tahoma" w:hAnsi="Tahoma" w:eastAsia="Tahoma" w:cs="Tahoma"/>
-        </w:rPr>
+        <w:t xml:space="preserve">NEXT_PUBLIC_SUPABASE_ANON_KEY=</w:t>
         <w:br/>
       </w:r>
       <w:r>
-        <w:rPr>
-          <w:rFonts w:ascii="Tahoma" w:hAnsi="Tahoma" w:eastAsia="Tahoma" w:cs="Tahoma"/>
-          <w:color w:val="404040"/>
-          <w:sz w:val="16"/>
-        </w:rPr>
-        <w:t>NEXT_PUBLIC_SUPABASE_ANON_KEY=</w:t>
-      </w:r>
-      <w:r>
-        <w:rPr>
-          <w:rFonts w:ascii="Tahoma" w:hAnsi="Tahoma" w:eastAsia="Tahoma" w:cs="Tahoma"/>
-        </w:rPr>
+        <w:t xml:space="preserve">SUPABASE_SERVICE_ROLE_KEY=</w:t>
         <w:br/>
       </w:r>
       <w:r>
-        <w:rPr>
-          <w:rFonts w:ascii="Tahoma" w:hAnsi="Tahoma" w:eastAsia="Tahoma" w:cs="Tahoma"/>
-          <w:color w:val="404040"/>
-          <w:sz w:val="16"/>
-        </w:rPr>
-        <w:t>SUPABASE_SERVICE_ROLE_KEY=</w:t>
-      </w:r>
-      <w:r>
-        <w:rPr>
-          <w:rFonts w:ascii="Tahoma" w:hAnsi="Tahoma" w:eastAsia="Tahoma" w:cs="Tahoma"/>
-        </w:rPr>
+        <w:t xml:space="preserve">TURNSTILE_SITE_KEY=&lt;TURNSTILE_SITE_KEY&gt;</w:t>
         <w:br/>
       </w:r>
       <w:r>
-        <w:rPr>
-          <w:rFonts w:ascii="Tahoma" w:hAnsi="Tahoma" w:eastAsia="Tahoma" w:cs="Tahoma"/>
-          <w:color w:val="404040"/>
-          <w:sz w:val="16"/>
-        </w:rPr>
-      </w:r>
-      <w:r>
-        <w:rPr>
-          <w:rFonts w:ascii="Tahoma" w:hAnsi="Tahoma" w:eastAsia="Tahoma" w:cs="Tahoma"/>
-        </w:rPr>
+        <w:t xml:space="preserve">TURNSTILE_SECRET_KEY=&lt;TURNSTILE_SECRET_KEY&gt;</w:t>
         <w:br/>
       </w:r>
       <w:r>
-        <w:rPr>
-          <w:rFonts w:ascii="Tahoma" w:hAnsi="Tahoma" w:eastAsia="Tahoma" w:cs="Tahoma"/>
-          <w:color w:val="404040"/>
-          <w:sz w:val="16"/>
-        </w:rPr>
-        <w:t>TURNSTILE_SITE_KEY=&lt;TURNSTILE_SITE_KEY&gt;</w:t>
-      </w:r>
-      <w:r>
-        <w:rPr>
-          <w:rFonts w:ascii="Tahoma" w:hAnsi="Tahoma" w:eastAsia="Tahoma" w:cs="Tahoma"/>
-        </w:rPr>
+        <w:t xml:space="preserve">TURNSTILE_EXPECTED_HOSTNAME=vrrun.bu.ac.th</w:t>
         <w:br/>
       </w:r>
       <w:r>
-        <w:rPr>
-          <w:rFonts w:ascii="Tahoma" w:hAnsi="Tahoma" w:eastAsia="Tahoma" w:cs="Tahoma"/>
-          <w:color w:val="404040"/>
-          <w:sz w:val="16"/>
-        </w:rPr>
-        <w:t>TURNSTILE_SECRET_KEY=&lt;TURNSTILE_SECRET_KEY&gt;</w:t>
-      </w:r>
-      <w:r>
-        <w:rPr>
-          <w:rFonts w:ascii="Tahoma" w:hAnsi="Tahoma" w:eastAsia="Tahoma" w:cs="Tahoma"/>
-        </w:rPr>
+        <w:t xml:space="preserve">BACKEND_SETTINGS_ENCRYPTION_KEY=&lt;RANDOM_SECRET_AT_LEAST_32_CHARACTERS&gt;</w:t>
         <w:br/>
       </w:r>
       <w:r>
-        <w:rPr>
-          <w:rFonts w:ascii="Tahoma" w:hAnsi="Tahoma" w:eastAsia="Tahoma" w:cs="Tahoma"/>
-          <w:color w:val="404040"/>
-          <w:sz w:val="16"/>
-        </w:rPr>
-        <w:t>TURNSTILE_EXPECTED_HOSTNAME=vrrun.bu.ac.th</w:t>
-      </w:r>
-      <w:r>
-        <w:rPr>
-          <w:rFonts w:ascii="Tahoma" w:hAnsi="Tahoma" w:eastAsia="Tahoma" w:cs="Tahoma"/>
-        </w:rPr>
+        <w:t xml:space="preserve">SMTP_SETTINGS_ENCRYPTION_KEY=</w:t>
         <w:br/>
       </w:r>
       <w:r>
-        <w:rPr>
-          <w:rFonts w:ascii="Tahoma" w:hAnsi="Tahoma" w:eastAsia="Tahoma" w:cs="Tahoma"/>
-          <w:color w:val="404040"/>
-          <w:sz w:val="16"/>
-        </w:rPr>
-      </w:r>
-      <w:r>
-        <w:rPr>
-          <w:rFonts w:ascii="Tahoma" w:hAnsi="Tahoma" w:eastAsia="Tahoma" w:cs="Tahoma"/>
-        </w:rPr>
-        <w:br/>
-      </w:r>
-      <w:r>
-        <w:rPr>
-          <w:rFonts w:ascii="Tahoma" w:hAnsi="Tahoma" w:eastAsia="Tahoma" w:cs="Tahoma"/>
-          <w:color w:val="404040"/>
-          <w:sz w:val="16"/>
-        </w:rPr>
-        <w:t>BACKEND_SETTINGS_ENCRYPTION_KEY=&lt;RANDOM_SECRET_AT_LEAST_32_CHARACTERS&gt;</w:t>
-      </w:r>
-      <w:r>
-        <w:rPr>
-          <w:rFonts w:ascii="Tahoma" w:hAnsi="Tahoma" w:eastAsia="Tahoma" w:cs="Tahoma"/>
-        </w:rPr>
-        <w:br/>
-      </w:r>
-      <w:r>
-        <w:rPr>
-          <w:rFonts w:ascii="Tahoma" w:hAnsi="Tahoma" w:eastAsia="Tahoma" w:cs="Tahoma"/>
-          <w:color w:val="404040"/>
-          <w:sz w:val="16"/>
-        </w:rPr>
-        <w:t>SMTP_SETTINGS_ENCRYPTION_KEY=</w:t>
+        <w:t xml:space="preserve">EVIDENCE_RETENTION_CRON_SECRET=&lt;DIFFERENT_RANDOM_SECRET_AT_LEAST_32_CHARACTERS&gt;</w:t>
       </w:r>
     </w:p>
     <w:p>
@@ -6344,10 +6028,7 @@
         <w:pStyle w:val="BodyText"/>
       </w:pPr>
       <w:r>
-        <w:rPr>
-          <w:rFonts w:ascii="Tahoma" w:hAnsi="Tahoma" w:eastAsia="Tahoma" w:cs="Tahoma"/>
-        </w:rPr>
-        <w:t>ค่า NEXT_PUBLIC_SUPABASE_PUBLISHABLE_KEY ถูกฝังใน browser bundle และเปิดเผยได้ตามหน้าที่ แต่ SUPABASE_SECRET_KEY และ BACKEND_SETTINGS_ENCRYPTION_KEY ต้องอยู่เฉพาะ server ห้ามใส่คำว่า NEXT_PUBLIC นำหน้าค่าลับ</w:t>
+        <w:t xml:space="preserve">ค่า NEXT_PUBLIC_SUPABASE_PUBLISHABLE_KEY ถูกฝังใน browser bundle และเปิดเผยได้ตามหน้าที่ แต่ SUPABASE_SECRET_KEY, BACKEND_SETTINGS_ENCRYPTION_KEY และ EVIDENCE_RETENTION_CRON_SECRET ต้องอยู่เฉพาะ server ห้ามใส่คำว่า NEXT_PUBLIC นำหน้าค่าลับ</w:t>
       </w:r>
     </w:p>
     <w:p>
@@ -6394,6 +6075,38 @@
     <w:p>
       <w:pPr>
         <w:pStyle w:val="Heading2"/>
+      </w:pPr>
+      <w:r>
+        <w:t xml:space="preserve">สร้าง Evidence Retention cron secret</w:t>
+      </w:r>
+    </w:p>
+    <w:p>
+      <w:pPr>
+        <w:pStyle w:val="BodyText"/>
+      </w:pPr>
+      <w:r>
+        <w:t xml:space="preserve">สร้าง secret แยกจาก Backend encryption key เพื่อใช้ยืนยันคำขอ cron เท่านั้น</w:t>
+      </w:r>
+    </w:p>
+    <w:p>
+      <w:pPr>
+        <w:pStyle w:val="CodeBlock"/>
+      </w:pPr>
+      <w:r>
+        <w:t xml:space="preserve">openssl rand -hex 32</w:t>
+      </w:r>
+    </w:p>
+    <w:p>
+      <w:pPr>
+        <w:pStyle w:val="BodyText"/>
+      </w:pPr>
+      <w:r>
+        <w:t xml:space="preserve">นำผลลัพธ์ 64 ตัวอักษรไปใส่ EVIDENCE_RETENTION_CRON_SECRET ใน .env ห้ามใช้ค่าซ้ำกับ BACKEND_SETTINGS_ENCRYPTION_KEY ห้าม commit และห้ามตั้งชื่อแบบ NEXT_PUBLIC</w:t>
+      </w:r>
+    </w:p>
+    <w:p>
+      <w:pPr>
+        <w:pStyle w:val="Heading2"/>
         <w:keepNext/>
         <w:pageBreakBefore w:val="0"/>
       </w:pPr>
@@ -6647,108 +6360,34 @@
         <w:shd w:fill="F2F2F2"/>
       </w:pPr>
       <w:r>
-        <w:rPr>
-          <w:rFonts w:ascii="Tahoma" w:hAnsi="Tahoma" w:eastAsia="Tahoma" w:cs="Tahoma"/>
-          <w:color w:val="404040"/>
-          <w:sz w:val="16"/>
-        </w:rPr>
-        <w:t>for key in SITE_URL NEXT_PUBLIC_SITE_URL NEXT_PUBLIC_SUPABASE_URL \</w:t>
-      </w:r>
-      <w:r>
-        <w:rPr>
-          <w:rFonts w:ascii="Tahoma" w:hAnsi="Tahoma" w:eastAsia="Tahoma" w:cs="Tahoma"/>
-        </w:rPr>
+        <w:t xml:space="preserve">for key in SITE_URL NEXT_PUBLIC_SITE_URL NEXT_PUBLIC_SUPABASE_URL \</w:t>
         <w:br/>
       </w:r>
       <w:r>
-        <w:rPr>
-          <w:rFonts w:ascii="Tahoma" w:hAnsi="Tahoma" w:eastAsia="Tahoma" w:cs="Tahoma"/>
-          <w:color w:val="404040"/>
-          <w:sz w:val="16"/>
-        </w:rPr>
-        <w:t>SUPABASE_URL NEXT_PUBLIC_SUPABASE_PUBLISHABLE_KEY SUPABASE_SECRET_KEY \</w:t>
-      </w:r>
-      <w:r>
-        <w:rPr>
-          <w:rFonts w:ascii="Tahoma" w:hAnsi="Tahoma" w:eastAsia="Tahoma" w:cs="Tahoma"/>
-        </w:rPr>
+        <w:t xml:space="preserve">SUPABASE_URL NEXT_PUBLIC_SUPABASE_PUBLISHABLE_KEY SUPABASE_SECRET_KEY \</w:t>
         <w:br/>
       </w:r>
       <w:r>
-        <w:rPr>
-          <w:rFonts w:ascii="Tahoma" w:hAnsi="Tahoma" w:eastAsia="Tahoma" w:cs="Tahoma"/>
-          <w:color w:val="404040"/>
-          <w:sz w:val="16"/>
-        </w:rPr>
-        <w:t>TURNSTILE_SITE_KEY TURNSTILE_SECRET_KEY BACKEND_SETTINGS_ENCRYPTION_KEY; do</w:t>
-      </w:r>
-      <w:r>
-        <w:rPr>
-          <w:rFonts w:ascii="Tahoma" w:hAnsi="Tahoma" w:eastAsia="Tahoma" w:cs="Tahoma"/>
-        </w:rPr>
+        <w:t xml:space="preserve">TURNSTILE_SITE_KEY TURNSTILE_SECRET_KEY BACKEND_SETTINGS_ENCRYPTION_KEY \</w:t>
         <w:br/>
       </w:r>
       <w:r>
-        <w:rPr>
-          <w:rFonts w:ascii="Tahoma" w:hAnsi="Tahoma" w:eastAsia="Tahoma" w:cs="Tahoma"/>
-          <w:color w:val="404040"/>
-          <w:sz w:val="16"/>
-        </w:rPr>
+        <w:t xml:space="preserve">EVIDENCE_RETENTION_CRON_SECRET; do</w:t>
+        <w:br/>
+      </w:r>
+      <w:r>
         <w:t xml:space="preserve">  grep -Eq "^${key}=.+" .env || echo "MISSING: ${key}"</w:t>
-      </w:r>
-      <w:r>
-        <w:rPr>
-          <w:rFonts w:ascii="Tahoma" w:hAnsi="Tahoma" w:eastAsia="Tahoma" w:cs="Tahoma"/>
-        </w:rPr>
         <w:br/>
       </w:r>
       <w:r>
-        <w:rPr>
-          <w:rFonts w:ascii="Tahoma" w:hAnsi="Tahoma" w:eastAsia="Tahoma" w:cs="Tahoma"/>
-          <w:color w:val="404040"/>
-          <w:sz w:val="16"/>
-        </w:rPr>
-        <w:t>done</w:t>
-      </w:r>
-      <w:r>
-        <w:rPr>
-          <w:rFonts w:ascii="Tahoma" w:hAnsi="Tahoma" w:eastAsia="Tahoma" w:cs="Tahoma"/>
-        </w:rPr>
+        <w:t xml:space="preserve">done</w:t>
         <w:br/>
       </w:r>
       <w:r>
-        <w:rPr>
-          <w:rFonts w:ascii="Tahoma" w:hAnsi="Tahoma" w:eastAsia="Tahoma" w:cs="Tahoma"/>
-          <w:color w:val="404040"/>
-          <w:sz w:val="16"/>
-        </w:rPr>
-      </w:r>
-      <w:r>
-        <w:rPr>
-          <w:rFonts w:ascii="Tahoma" w:hAnsi="Tahoma" w:eastAsia="Tahoma" w:cs="Tahoma"/>
-        </w:rPr>
+        <w:t xml:space="preserve">docker compose -f docker-compose.yml -f docker-compose.server.yml \</w:t>
         <w:br/>
       </w:r>
       <w:r>
-        <w:rPr>
-          <w:rFonts w:ascii="Tahoma" w:hAnsi="Tahoma" w:eastAsia="Tahoma" w:cs="Tahoma"/>
-          <w:color w:val="404040"/>
-          <w:sz w:val="16"/>
-        </w:rPr>
-        <w:t>docker compose -f docker-compose.yml -f docker-compose.server.yml \</w:t>
-      </w:r>
-      <w:r>
-        <w:rPr>
-          <w:rFonts w:ascii="Tahoma" w:hAnsi="Tahoma" w:eastAsia="Tahoma" w:cs="Tahoma"/>
-        </w:rPr>
-        <w:br/>
-      </w:r>
-      <w:r>
-        <w:rPr>
-          <w:rFonts w:ascii="Tahoma" w:hAnsi="Tahoma" w:eastAsia="Tahoma" w:cs="Tahoma"/>
-          <w:color w:val="404040"/>
-          <w:sz w:val="16"/>
-        </w:rPr>
         <w:t xml:space="preserve">  config --quiet</w:t>
       </w:r>
     </w:p>
@@ -7920,96 +7559,27 @@
         <w:shd w:fill="F2F2F2"/>
       </w:pPr>
       <w:r>
-        <w:rPr>
-          <w:rFonts w:ascii="Tahoma" w:hAnsi="Tahoma" w:eastAsia="Tahoma" w:cs="Tahoma"/>
-          <w:color w:val="404040"/>
-          <w:sz w:val="16"/>
-        </w:rPr>
-        <w:t>docker exec Virtual-RUN sh -lc '</w:t>
-      </w:r>
-      <w:r>
-        <w:rPr>
-          <w:rFonts w:ascii="Tahoma" w:hAnsi="Tahoma" w:eastAsia="Tahoma" w:cs="Tahoma"/>
-        </w:rPr>
+        <w:t xml:space="preserve">docker exec Virtual-RUN sh -lc 'for key in SITE_URL NEXT_PUBLIC_SITE_URL NEXT_PUBLIC_SUPABASE_URL \</w:t>
         <w:br/>
       </w:r>
       <w:r>
-        <w:rPr>
-          <w:rFonts w:ascii="Tahoma" w:hAnsi="Tahoma" w:eastAsia="Tahoma" w:cs="Tahoma"/>
-          <w:color w:val="404040"/>
-          <w:sz w:val="16"/>
-        </w:rPr>
-        <w:t>for key in SITE_URL NEXT_PUBLIC_SITE_URL NEXT_PUBLIC_SUPABASE_URL \</w:t>
-      </w:r>
-      <w:r>
-        <w:rPr>
-          <w:rFonts w:ascii="Tahoma" w:hAnsi="Tahoma" w:eastAsia="Tahoma" w:cs="Tahoma"/>
-        </w:rPr>
+        <w:t xml:space="preserve">SUPABASE_URL NEXT_PUBLIC_SUPABASE_PUBLISHABLE_KEY SUPABASE_SECRET_KEY \</w:t>
         <w:br/>
       </w:r>
       <w:r>
-        <w:rPr>
-          <w:rFonts w:ascii="Tahoma" w:hAnsi="Tahoma" w:eastAsia="Tahoma" w:cs="Tahoma"/>
-          <w:color w:val="404040"/>
-          <w:sz w:val="16"/>
-        </w:rPr>
-        <w:t>SUPABASE_URL NEXT_PUBLIC_SUPABASE_PUBLISHABLE_KEY SUPABASE_SECRET_KEY \</w:t>
-      </w:r>
-      <w:r>
-        <w:rPr>
-          <w:rFonts w:ascii="Tahoma" w:hAnsi="Tahoma" w:eastAsia="Tahoma" w:cs="Tahoma"/>
-        </w:rPr>
+        <w:t xml:space="preserve">BACKEND_SETTINGS_ENCRYPTION_KEY EVIDENCE_RETENTION_CRON_SECRET; do</w:t>
         <w:br/>
       </w:r>
       <w:r>
-        <w:rPr>
-          <w:rFonts w:ascii="Tahoma" w:hAnsi="Tahoma" w:eastAsia="Tahoma" w:cs="Tahoma"/>
-          <w:color w:val="404040"/>
-          <w:sz w:val="16"/>
-        </w:rPr>
-        <w:t>BACKEND_SETTINGS_ENCRYPTION_KEY; do</w:t>
-      </w:r>
-      <w:r>
-        <w:rPr>
-          <w:rFonts w:ascii="Tahoma" w:hAnsi="Tahoma" w:eastAsia="Tahoma" w:cs="Tahoma"/>
-        </w:rPr>
+        <w:t xml:space="preserve">  eval value="\$$key"</w:t>
         <w:br/>
       </w:r>
       <w:r>
-        <w:rPr>
-          <w:rFonts w:ascii="Tahoma" w:hAnsi="Tahoma" w:eastAsia="Tahoma" w:cs="Tahoma"/>
-          <w:color w:val="404040"/>
-          <w:sz w:val="16"/>
-        </w:rPr>
-        <w:t xml:space="preserve">  eval value=\"\$$key\"</w:t>
-      </w:r>
-      <w:r>
-        <w:rPr>
-          <w:rFonts w:ascii="Tahoma" w:hAnsi="Tahoma" w:eastAsia="Tahoma" w:cs="Tahoma"/>
-        </w:rPr>
+        <w:t xml:space="preserve">  [ -n "$value" ] &amp;&amp; echo "OK: $key" || echo "MISSING: $key"</w:t>
         <w:br/>
       </w:r>
       <w:r>
-        <w:rPr>
-          <w:rFonts w:ascii="Tahoma" w:hAnsi="Tahoma" w:eastAsia="Tahoma" w:cs="Tahoma"/>
-          <w:color w:val="404040"/>
-          <w:sz w:val="16"/>
-        </w:rPr>
-        <w:t xml:space="preserve">  [ -n "$value" ] &amp;&amp; echo "OK: $key" || echo "MISSING: $key"</w:t>
-      </w:r>
-      <w:r>
-        <w:rPr>
-          <w:rFonts w:ascii="Tahoma" w:hAnsi="Tahoma" w:eastAsia="Tahoma" w:cs="Tahoma"/>
-        </w:rPr>
-        <w:br/>
-      </w:r>
-      <w:r>
-        <w:rPr>
-          <w:rFonts w:ascii="Tahoma" w:hAnsi="Tahoma" w:eastAsia="Tahoma" w:cs="Tahoma"/>
-          <w:color w:val="404040"/>
-          <w:sz w:val="16"/>
-        </w:rPr>
-        <w:t>done'</w:t>
+        <w:t xml:space="preserve">done'</w:t>
       </w:r>
     </w:p>
     <w:p>
@@ -8704,6 +8274,66 @@
     <w:p>
       <w:pPr>
         <w:pStyle w:val="Heading2"/>
+      </w:pPr>
+      <w:r>
+        <w:t xml:space="preserve">ตั้งค่าการเก็บหลักฐานการวิ่ง</w:t>
+      </w:r>
+    </w:p>
+    <w:p>
+      <w:pPr>
+        <w:pStyle w:val="BodyText"/>
+      </w:pPr>
+      <w:r>
+        <w:t xml:space="preserve">เปิด https://vrrun.bu.ac.th/admin/storage ด้วยบัญชี Super Admin ค่าเริ่มต้นคือเก็บหลักฐาน 180 วันหลังวันจบกิจกรรม รายกิจกรรมสามารถเว้นว่างเพื่อรับค่าระบบ ใส่ 0 เพื่อเก็บถาวร หรือกำหนด 30 ถึง 3,650 วัน</w:t>
+      </w:r>
+    </w:p>
+    <w:p>
+      <w:pPr>
+        <w:pStyle w:val="BodyText"/>
+      </w:pPr>
+      <w:r>
+        <w:t xml:space="preserve">ระบบเลือกเฉพาะหลักฐานสถานะ approved และ rejected ไฟล์จะถูกลบผ่าน Supabase Storage API แต่ผลวิ่ง OCR และ fingerprint ยังคงอยู่ ตรวจจำนวนไฟล์และพื้นที่โดยประมาณก่อนลบทุกครั้ง</w:t>
+      </w:r>
+    </w:p>
+    <w:p>
+      <w:pPr>
+        <w:pStyle w:val="Heading2"/>
+      </w:pPr>
+      <w:r>
+        <w:t xml:space="preserve">ตั้ง cron สำหรับ Evidence Retention</w:t>
+      </w:r>
+    </w:p>
+    <w:p>
+      <w:pPr>
+        <w:pStyle w:val="BodyText"/>
+      </w:pPr>
+      <w:r>
+        <w:t xml:space="preserve">ตั้ง cron หลัง apply migration และตรวจหน้า /admin/storage แล้วเท่านั้น คำขอที่ยืนยันตัวตนสำเร็จสามารถลบไฟล์ที่เข้าเกณฑ์ได้ทันที</w:t>
+      </w:r>
+    </w:p>
+    <w:p>
+      <w:pPr>
+        <w:pStyle w:val="CodeBlock"/>
+      </w:pPr>
+      <w:r>
+        <w:t xml:space="preserve">sudo crontab -e</w:t>
+        <w:br/>
+      </w:r>
+      <w:r>
+        <w:t xml:space="preserve">0 3 * * * cd /webserver/vrrun_bu_ac_th &amp;&amp; set -a &amp;&amp; . ./.env &amp;&amp; set +a &amp;&amp; curl --fail --silent --show-error --request POST --header "Authorization: Bearer $EVIDENCE_RETENTION_CRON_SECRET" https://vrrun.bu.ac.th/api/cron/evidence-retention</w:t>
+      </w:r>
+    </w:p>
+    <w:p>
+      <w:pPr>
+        <w:pStyle w:val="BodyText"/>
+      </w:pPr>
+      <w:r>
+        <w:t xml:space="preserve">cron ไม่รับ environment ของ Docker Compose โดยอัตโนมัติ จึงต้องโหลด .env ที่ permission 600 ก่อนเรียก endpoint ห้ามส่ง secret ผ่าน chat, ticket หรือ log</w:t>
+      </w:r>
+    </w:p>
+    <w:p>
+      <w:pPr>
+        <w:pStyle w:val="Heading2"/>
         <w:keepNext/>
         <w:pageBreakBefore w:val="0"/>
       </w:pPr>
@@ -9427,10 +9057,7 @@
         <w:ind w:left="259" w:hanging="259"/>
       </w:pPr>
       <w:r>
-        <w:rPr>
-          <w:rFonts w:ascii="Tahoma" w:hAnsi="Tahoma" w:eastAsia="Tahoma" w:cs="Tahoma"/>
-        </w:rPr>
-        <w:t>[ ] Super Admin เปิด /admin, /admin/settings และ /admin/integrations ได้</w:t>
+        <w:t xml:space="preserve">[ ] Super Admin เปิด /admin, /admin/settings, /admin/integrations และ /admin/storage ได้</w:t>
       </w:r>
     </w:p>
     <w:p>
@@ -9500,10 +9127,7 @@
         <w:ind w:left="259" w:hanging="259"/>
       </w:pPr>
       <w:r>
-        <w:rPr>
-          <w:rFonts w:ascii="Tahoma" w:hAnsi="Tahoma" w:eastAsia="Tahoma" w:cs="Tahoma"/>
-        </w:rPr>
-        <w:t>[ ] migration smtp_settings และ integration_settings อยู่ใน production</w:t>
+        <w:t xml:space="preserve">[ ] migration smtp_settings, integration_settings และ add_evidence_retention อยู่ใน production</w:t>
       </w:r>
     </w:p>
     <w:p>
@@ -10018,10 +9642,50 @@
         <w:pStyle w:val="ListBullet"/>
       </w:pPr>
       <w:r>
+        <w:t xml:space="preserve">ตรวจ EVIDENCE_RETENTION_CRON_SECRET ยาวอย่างน้อย 32 ตัวอักษรและเป็นคนละค่ากับ Backend encryption key</w:t>
+      </w:r>
+    </w:p>
+    <w:p>
+      <w:pPr>
+        <w:pStyle w:val="ListBullet"/>
+      </w:pPr>
+      <w:r>
         <w:rPr>
           <w:rFonts w:ascii="Tahoma" w:hAnsi="Tahoma" w:eastAsia="Tahoma" w:cs="Tahoma"/>
         </w:rPr>
         <w:t>ห้ามเปลี่ยน encryption key หลังมีข้อมูลเข้ารหัสแล้ว</w:t>
+      </w:r>
+    </w:p>
+    <w:p>
+      <w:pPr>
+        <w:pStyle w:val="Heading2"/>
+      </w:pPr>
+      <w:r>
+        <w:t xml:space="preserve">Evidence Retention cron ตอบ 503</w:t>
+      </w:r>
+    </w:p>
+    <w:p>
+      <w:pPr>
+        <w:pStyle w:val="ListBullet"/>
+      </w:pPr>
+      <w:r>
+        <w:t xml:space="preserve">ตรวจว่ามี EVIDENCE_RETENTION_CRON_SECRET ใน .env และยาวอย่างน้อย 32 ตัวอักษร</w:t>
+      </w:r>
+    </w:p>
+    <w:p>
+      <w:pPr>
+        <w:pStyle w:val="ListBullet"/>
+      </w:pPr>
+      <w:r>
+        <w:t xml:space="preserve">recreate container หลังแก้ .env แล้วตรวจตัวแปรใน container โดยไม่พิมพ์ค่า secret</w:t>
+      </w:r>
+    </w:p>
+    <w:p>
+      <w:pPr>
+        <w:pStyle w:val="ListBullet"/>
+      </w:pPr>
+      <w:r>
+        <w:t xml:space="preserve">ตรวจหน้า /admin/storage และ apply migration ก่อนเปิด cron ห้ามทดสอบ authenticated POST หากยังไม่พร้อมลบไฟล์ที่เข้าเกณฑ์</w:t>
       </w:r>
     </w:p>
     <w:p>
@@ -11784,7 +11448,7 @@
                 <w:rFonts w:ascii="Tahoma" w:hAnsi="Tahoma" w:eastAsia="Tahoma" w:cs="Tahoma"/>
                 <w:sz w:val="18"/>
               </w:rPr>
-              <w:t>4913fc71475bc5ad5038e4c0a7ca194c432b63ab</w:t>
+              <w:t>c4078996e32d580f232abe25a99bbc8148e9f385</w:t>
             </w:r>
           </w:p>
         </w:tc>
@@ -11986,7 +11650,7 @@
                 <w:rFonts w:ascii="Tahoma" w:hAnsi="Tahoma" w:eastAsia="Tahoma" w:cs="Tahoma"/>
                 <w:sz w:val="18"/>
               </w:rPr>
-              <w:t>55 ไฟล์ รวม 20260908013509_integration_settings.sql</w:t>
+              <w:t>56 ไฟล์ รวม 20260908051746_add_evidence_retention.sql</w:t>
             </w:r>
           </w:p>
         </w:tc>

</xml_diff>